<commit_message>
changed all function analysis txt into one single word file. Exported all word files into pdfs as well.
</commit_message>
<xml_diff>
--- a/doc/ex2/functions_analysis.docx
+++ b/doc/ex2/functions_analysis.docx
@@ -2,7 +2,1360 @@
 <file path=word/document.xml><?xml version="1.0" encoding="utf-8"?>
 <w:document xmlns:wpc="http://schemas.microsoft.com/office/word/2010/wordprocessingCanvas" xmlns:cx="http://schemas.microsoft.com/office/drawing/2014/chartex" xmlns:cx1="http://schemas.microsoft.com/office/drawing/2015/9/8/chartex" xmlns:cx2="http://schemas.microsoft.com/office/drawing/2015/10/21/chartex" xmlns:cx3="http://schemas.microsoft.com/office/drawing/2016/5/9/chartex" xmlns:cx4="http://schemas.microsoft.com/office/drawing/2016/5/10/chartex" xmlns:cx5="http://schemas.microsoft.com/office/drawing/2016/5/11/chartex" xmlns:cx6="http://schemas.microsoft.com/office/drawing/2016/5/12/chartex" xmlns:cx7="http://schemas.microsoft.com/office/drawing/2016/5/13/chartex" xmlns:cx8="http://schemas.microsoft.com/office/drawing/2016/5/14/chartex" xmlns:mc="http://schemas.openxmlformats.org/markup-compatibility/2006" xmlns:aink="http://schemas.microsoft.com/office/drawing/2016/ink" xmlns:am3d="http://schemas.microsoft.com/office/drawing/2017/model3d" xmlns:o="urn:schemas-microsoft-com:office:office" xmlns:oel="http://schemas.microsoft.com/office/2019/extlst" xmlns:r="http://schemas.openxmlformats.org/officeDocument/2006/relationships" xmlns:m="http://schemas.openxmlformats.org/officeDocument/2006/math" xmlns:v="urn:schemas-microsoft-com:vml" xmlns:wp14="http://schemas.microsoft.com/office/word/2010/wordprocessingDrawing" xmlns:wp="http://schemas.openxmlformats.org/drawingml/2006/wordprocessingDrawing" xmlns:w10="urn:schemas-microsoft-com:office:word" xmlns:w="http://schemas.openxmlformats.org/wordprocessingml/2006/main" xmlns:w14="http://schemas.microsoft.com/office/word/2010/wordml" xmlns:w15="http://schemas.microsoft.com/office/word/2012/wordml" xmlns:w16cex="http://schemas.microsoft.com/office/word/2018/wordml/cex" xmlns:w16cid="http://schemas.microsoft.com/office/word/2016/wordml/cid" xmlns:w16="http://schemas.microsoft.com/office/word/2018/wordml" xmlns:w16du="http://schemas.microsoft.com/office/word/2023/wordml/word16du" xmlns:w16sdtdh="http://schemas.microsoft.com/office/word/2020/wordml/sdtdatahash" xmlns:w16sdtfl="http://schemas.microsoft.com/office/word/2024/wordml/sdtformatlock" xmlns:w16se="http://schemas.microsoft.com/office/word/2015/wordml/symex" xmlns:wpg="http://schemas.microsoft.com/office/word/2010/wordprocessingGroup" xmlns:wpi="http://schemas.microsoft.com/office/word/2010/wordprocessingInk" xmlns:wne="http://schemas.microsoft.com/office/word/2006/wordml" xmlns:wps="http://schemas.microsoft.com/office/word/2010/wordprocessingShape" mc:Ignorable="w14 w15 w16se w16cid w16 w16cex w16sdtdh w16sdtfl w16du wp14">
   <w:body>
-    <w:p/>
+    <w:p>
+      <w:pPr>
+        <w:jc w:val="both"/>
+        <w:rPr>
+          <w:sz w:val="28"/>
+          <w:szCs w:val="28"/>
+          <w:lang w:val="en-US"/>
+        </w:rPr>
+      </w:pPr>
+      <w:r>
+        <w:rPr>
+          <w:sz w:val="28"/>
+          <w:szCs w:val="28"/>
+          <w:lang w:val="en-US"/>
+        </w:rPr>
+        <w:t>Functions Analysis:</w:t>
+      </w:r>
+    </w:p>
+    <w:p>
+      <w:pPr>
+        <w:jc w:val="both"/>
+        <w:rPr>
+          <w:lang w:val="en-US"/>
+        </w:rPr>
+      </w:pPr>
+      <w:r>
+        <w:rPr>
+          <w:lang w:val="en-US"/>
+        </w:rPr>
+        <w:t>F1:</w:t>
+      </w:r>
+      <w:r>
+        <w:rPr>
+          <w:noProof/>
+        </w:rPr>
+        <w:t xml:space="preserve"> </w:t>
+      </w:r>
+    </w:p>
+    <w:p>
+      <w:pPr>
+        <w:jc w:val="both"/>
+        <w:rPr>
+          <w:lang w:val="en-US"/>
+        </w:rPr>
+      </w:pPr>
+      <w:r>
+        <w:rPr>
+          <w:noProof/>
+        </w:rPr>
+        <w:drawing>
+          <wp:anchor distT="0" distB="0" distL="114300" distR="114300" simplePos="0" relativeHeight="251658240" behindDoc="0" locked="0" layoutInCell="1" allowOverlap="1" wp14:anchorId="01586810" wp14:editId="330C7D17">
+            <wp:simplePos x="0" y="0"/>
+            <wp:positionH relativeFrom="margin">
+              <wp:align>left</wp:align>
+            </wp:positionH>
+            <wp:positionV relativeFrom="paragraph">
+              <wp:posOffset>6350</wp:posOffset>
+            </wp:positionV>
+            <wp:extent cx="3028950" cy="3028950"/>
+            <wp:effectExtent l="0" t="0" r="0" b="0"/>
+            <wp:wrapThrough wrapText="bothSides">
+              <wp:wrapPolygon edited="0">
+                <wp:start x="0" y="0"/>
+                <wp:lineTo x="0" y="21464"/>
+                <wp:lineTo x="21464" y="21464"/>
+                <wp:lineTo x="21464" y="0"/>
+                <wp:lineTo x="0" y="0"/>
+              </wp:wrapPolygon>
+            </wp:wrapThrough>
+            <wp:docPr id="591820965" name="Picture 1" descr="A graph with a line&#10;&#10;AI-generated content may be incorrect."/>
+            <wp:cNvGraphicFramePr>
+              <a:graphicFrameLocks xmlns:a="http://schemas.openxmlformats.org/drawingml/2006/main" noChangeAspect="1"/>
+            </wp:cNvGraphicFramePr>
+            <a:graphic xmlns:a="http://schemas.openxmlformats.org/drawingml/2006/main">
+              <a:graphicData uri="http://schemas.openxmlformats.org/drawingml/2006/picture">
+                <pic:pic xmlns:pic="http://schemas.openxmlformats.org/drawingml/2006/picture">
+                  <pic:nvPicPr>
+                    <pic:cNvPr id="591820965" name="Picture 1" descr="A graph with a line&#10;&#10;AI-generated content may be incorrect."/>
+                    <pic:cNvPicPr/>
+                  </pic:nvPicPr>
+                  <pic:blipFill>
+                    <a:blip r:embed="rId4">
+                      <a:extLst>
+                        <a:ext uri="{28A0092B-C50C-407E-A947-70E740481C1C}">
+                          <a14:useLocalDpi xmlns:a14="http://schemas.microsoft.com/office/drawing/2010/main" val="0"/>
+                        </a:ext>
+                      </a:extLst>
+                    </a:blip>
+                    <a:stretch>
+                      <a:fillRect/>
+                    </a:stretch>
+                  </pic:blipFill>
+                  <pic:spPr>
+                    <a:xfrm>
+                      <a:off x="0" y="0"/>
+                      <a:ext cx="3028950" cy="3028950"/>
+                    </a:xfrm>
+                    <a:prstGeom prst="rect">
+                      <a:avLst/>
+                    </a:prstGeom>
+                  </pic:spPr>
+                </pic:pic>
+              </a:graphicData>
+            </a:graphic>
+          </wp:anchor>
+        </w:drawing>
+      </w:r>
+    </w:p>
+    <w:p>
+      <w:pPr>
+        <w:jc w:val="both"/>
+        <w:rPr>
+          <w:lang w:val="en-US"/>
+        </w:rPr>
+      </w:pPr>
+      <w:r>
+        <w:rPr>
+          <w:lang w:val="en-US"/>
+        </w:rPr>
+        <w:t xml:space="preserve">For Function 1, both RLS and the (1+1) EA reaches the optimum consistently, with RLS showing faster early progress. In </w:t>
+      </w:r>
+      <w:r>
+        <w:rPr>
+          <w:lang w:val="en-US"/>
+        </w:rPr>
+        <w:t>comparison</w:t>
+      </w:r>
+      <w:r>
+        <w:rPr>
+          <w:lang w:val="en-US"/>
+        </w:rPr>
+        <w:t>, random Search performs much worse, never reaching optimum.</w:t>
+      </w:r>
+      <w:r>
+        <w:rPr>
+          <w:lang w:val="en-US"/>
+        </w:rPr>
+        <w:t xml:space="preserve"> </w:t>
+      </w:r>
+      <w:r>
+        <w:rPr>
+          <w:lang w:val="en-US"/>
+        </w:rPr>
+        <w:t>Variance is low for RLS and (1+1) EA across different runs, but random search is higher.</w:t>
+      </w:r>
+      <w:r>
+        <w:rPr>
+          <w:lang w:val="en-US"/>
+        </w:rPr>
+        <w:t xml:space="preserve"> </w:t>
+      </w:r>
+      <w:r>
+        <w:rPr>
+          <w:lang w:val="en-US"/>
+        </w:rPr>
+        <w:t>It highlights the effectiveness of guided search over random sampling.</w:t>
+      </w:r>
+    </w:p>
+    <w:p>
+      <w:pPr>
+        <w:jc w:val="both"/>
+        <w:rPr>
+          <w:lang w:val="en-US"/>
+        </w:rPr>
+      </w:pPr>
+    </w:p>
+    <w:p>
+      <w:pPr>
+        <w:jc w:val="both"/>
+        <w:rPr>
+          <w:lang w:val="en-US"/>
+        </w:rPr>
+      </w:pPr>
+    </w:p>
+    <w:p>
+      <w:pPr>
+        <w:jc w:val="both"/>
+        <w:rPr>
+          <w:lang w:val="en-US"/>
+        </w:rPr>
+      </w:pPr>
+      <w:r>
+        <w:rPr>
+          <w:noProof/>
+        </w:rPr>
+        <w:drawing>
+          <wp:anchor distT="0" distB="0" distL="114300" distR="114300" simplePos="0" relativeHeight="251659264" behindDoc="0" locked="0" layoutInCell="1" allowOverlap="1" wp14:anchorId="167FB021" wp14:editId="0BA37D38">
+            <wp:simplePos x="0" y="0"/>
+            <wp:positionH relativeFrom="column">
+              <wp:posOffset>-38100</wp:posOffset>
+            </wp:positionH>
+            <wp:positionV relativeFrom="paragraph">
+              <wp:posOffset>321945</wp:posOffset>
+            </wp:positionV>
+            <wp:extent cx="3086735" cy="3101975"/>
+            <wp:effectExtent l="0" t="0" r="0" b="3175"/>
+            <wp:wrapThrough wrapText="bothSides">
+              <wp:wrapPolygon edited="0">
+                <wp:start x="0" y="0"/>
+                <wp:lineTo x="0" y="21489"/>
+                <wp:lineTo x="21462" y="21489"/>
+                <wp:lineTo x="21462" y="0"/>
+                <wp:lineTo x="0" y="0"/>
+              </wp:wrapPolygon>
+            </wp:wrapThrough>
+            <wp:docPr id="659652452" name="Picture 1" descr="A graph with a line graph&#10;&#10;AI-generated content may be incorrect."/>
+            <wp:cNvGraphicFramePr>
+              <a:graphicFrameLocks xmlns:a="http://schemas.openxmlformats.org/drawingml/2006/main" noChangeAspect="1"/>
+            </wp:cNvGraphicFramePr>
+            <a:graphic xmlns:a="http://schemas.openxmlformats.org/drawingml/2006/main">
+              <a:graphicData uri="http://schemas.openxmlformats.org/drawingml/2006/picture">
+                <pic:pic xmlns:pic="http://schemas.openxmlformats.org/drawingml/2006/picture">
+                  <pic:nvPicPr>
+                    <pic:cNvPr id="659652452" name="Picture 1" descr="A graph with a line graph&#10;&#10;AI-generated content may be incorrect."/>
+                    <pic:cNvPicPr/>
+                  </pic:nvPicPr>
+                  <pic:blipFill>
+                    <a:blip r:embed="rId5">
+                      <a:extLst>
+                        <a:ext uri="{28A0092B-C50C-407E-A947-70E740481C1C}">
+                          <a14:useLocalDpi xmlns:a14="http://schemas.microsoft.com/office/drawing/2010/main" val="0"/>
+                        </a:ext>
+                      </a:extLst>
+                    </a:blip>
+                    <a:stretch>
+                      <a:fillRect/>
+                    </a:stretch>
+                  </pic:blipFill>
+                  <pic:spPr>
+                    <a:xfrm>
+                      <a:off x="0" y="0"/>
+                      <a:ext cx="3086735" cy="3101975"/>
+                    </a:xfrm>
+                    <a:prstGeom prst="rect">
+                      <a:avLst/>
+                    </a:prstGeom>
+                  </pic:spPr>
+                </pic:pic>
+              </a:graphicData>
+            </a:graphic>
+            <wp14:sizeRelH relativeFrom="margin">
+              <wp14:pctWidth>0</wp14:pctWidth>
+            </wp14:sizeRelH>
+            <wp14:sizeRelV relativeFrom="margin">
+              <wp14:pctHeight>0</wp14:pctHeight>
+            </wp14:sizeRelV>
+          </wp:anchor>
+        </w:drawing>
+      </w:r>
+      <w:r>
+        <w:rPr>
+          <w:lang w:val="en-US"/>
+        </w:rPr>
+        <w:t>F2:</w:t>
+      </w:r>
+      <w:r>
+        <w:rPr>
+          <w:noProof/>
+        </w:rPr>
+        <w:t xml:space="preserve"> </w:t>
+      </w:r>
+    </w:p>
+    <w:p>
+      <w:pPr>
+        <w:jc w:val="both"/>
+        <w:rPr>
+          <w:lang w:val="en-US"/>
+        </w:rPr>
+      </w:pPr>
+      <w:r>
+        <w:rPr>
+          <w:lang w:val="en-US"/>
+        </w:rPr>
+        <w:t xml:space="preserve">For function 2, both algorithms, RLS and the (1+1) </w:t>
+      </w:r>
+      <w:proofErr w:type="gramStart"/>
+      <w:r>
+        <w:rPr>
+          <w:lang w:val="en-US"/>
+        </w:rPr>
+        <w:t>EA,</w:t>
+      </w:r>
+      <w:proofErr w:type="gramEnd"/>
+      <w:r>
+        <w:rPr>
+          <w:lang w:val="en-US"/>
+        </w:rPr>
+        <w:t xml:space="preserve"> slowly improves and reaches optimum,</w:t>
+      </w:r>
+      <w:r>
+        <w:rPr>
+          <w:lang w:val="en-US"/>
+        </w:rPr>
+        <w:t xml:space="preserve"> </w:t>
+      </w:r>
+      <w:r>
+        <w:rPr>
+          <w:lang w:val="en-US"/>
+        </w:rPr>
+        <w:t>with (1+1) EA showing steadier progress. Random Search lags significantly, plateauing below optimum.</w:t>
+      </w:r>
+      <w:r>
+        <w:rPr>
+          <w:lang w:val="en-US"/>
+        </w:rPr>
+        <w:t xml:space="preserve"> </w:t>
+      </w:r>
+      <w:r>
+        <w:rPr>
+          <w:lang w:val="en-US"/>
+        </w:rPr>
+        <w:t xml:space="preserve">Variance is higher early on for all </w:t>
+      </w:r>
+      <w:r>
+        <w:rPr>
+          <w:lang w:val="en-US"/>
+        </w:rPr>
+        <w:t>methods but</w:t>
+      </w:r>
+      <w:r>
+        <w:rPr>
+          <w:lang w:val="en-US"/>
+        </w:rPr>
+        <w:t xml:space="preserve"> starts to narro</w:t>
+      </w:r>
+      <w:r>
+        <w:rPr>
+          <w:lang w:val="en-US"/>
+        </w:rPr>
+        <w:t>w</w:t>
+      </w:r>
+      <w:r>
+        <w:rPr>
+          <w:lang w:val="en-US"/>
+        </w:rPr>
+        <w:t xml:space="preserve"> as RLS and (1+1) EA begin converging.</w:t>
+      </w:r>
+      <w:r>
+        <w:rPr>
+          <w:lang w:val="en-US"/>
+        </w:rPr>
+        <w:t xml:space="preserve"> </w:t>
+      </w:r>
+      <w:r>
+        <w:rPr>
+          <w:lang w:val="en-US"/>
+        </w:rPr>
+        <w:t>Once again, random sampling is at a disadvantage.</w:t>
+      </w:r>
+    </w:p>
+    <w:p>
+      <w:pPr>
+        <w:jc w:val="both"/>
+        <w:rPr>
+          <w:lang w:val="en-US"/>
+        </w:rPr>
+      </w:pPr>
+    </w:p>
+    <w:p>
+      <w:pPr>
+        <w:jc w:val="both"/>
+        <w:rPr>
+          <w:lang w:val="en-US"/>
+        </w:rPr>
+      </w:pPr>
+    </w:p>
+    <w:p>
+      <w:pPr>
+        <w:jc w:val="both"/>
+        <w:rPr>
+          <w:lang w:val="en-US"/>
+        </w:rPr>
+      </w:pPr>
+    </w:p>
+    <w:p>
+      <w:pPr>
+        <w:jc w:val="both"/>
+        <w:rPr>
+          <w:lang w:val="en-US"/>
+        </w:rPr>
+      </w:pPr>
+    </w:p>
+    <w:p>
+      <w:pPr>
+        <w:jc w:val="both"/>
+        <w:rPr>
+          <w:lang w:val="en-US"/>
+        </w:rPr>
+      </w:pPr>
+    </w:p>
+    <w:p>
+      <w:pPr>
+        <w:jc w:val="both"/>
+        <w:rPr>
+          <w:lang w:val="en-US"/>
+        </w:rPr>
+      </w:pPr>
+    </w:p>
+    <w:p>
+      <w:pPr>
+        <w:jc w:val="both"/>
+        <w:rPr>
+          <w:lang w:val="en-US"/>
+        </w:rPr>
+      </w:pPr>
+    </w:p>
+    <w:p>
+      <w:pPr>
+        <w:jc w:val="both"/>
+        <w:rPr>
+          <w:lang w:val="en-US"/>
+        </w:rPr>
+      </w:pPr>
+    </w:p>
+    <w:p>
+      <w:pPr>
+        <w:jc w:val="both"/>
+        <w:rPr>
+          <w:lang w:val="en-US"/>
+        </w:rPr>
+      </w:pPr>
+      <w:r>
+        <w:rPr>
+          <w:noProof/>
+        </w:rPr>
+        <w:lastRenderedPageBreak/>
+        <w:drawing>
+          <wp:anchor distT="0" distB="0" distL="114300" distR="114300" simplePos="0" relativeHeight="251660288" behindDoc="0" locked="0" layoutInCell="1" allowOverlap="1" wp14:anchorId="270A032A" wp14:editId="0711BA55">
+            <wp:simplePos x="0" y="0"/>
+            <wp:positionH relativeFrom="margin">
+              <wp:posOffset>-57150</wp:posOffset>
+            </wp:positionH>
+            <wp:positionV relativeFrom="paragraph">
+              <wp:posOffset>219075</wp:posOffset>
+            </wp:positionV>
+            <wp:extent cx="3001645" cy="2998470"/>
+            <wp:effectExtent l="0" t="0" r="8255" b="0"/>
+            <wp:wrapThrough wrapText="bothSides">
+              <wp:wrapPolygon edited="0">
+                <wp:start x="0" y="0"/>
+                <wp:lineTo x="0" y="21408"/>
+                <wp:lineTo x="21522" y="21408"/>
+                <wp:lineTo x="21522" y="0"/>
+                <wp:lineTo x="0" y="0"/>
+              </wp:wrapPolygon>
+            </wp:wrapThrough>
+            <wp:docPr id="848655269" name="Picture 1" descr="A graph of a function&#10;&#10;AI-generated content may be incorrect."/>
+            <wp:cNvGraphicFramePr>
+              <a:graphicFrameLocks xmlns:a="http://schemas.openxmlformats.org/drawingml/2006/main" noChangeAspect="1"/>
+            </wp:cNvGraphicFramePr>
+            <a:graphic xmlns:a="http://schemas.openxmlformats.org/drawingml/2006/main">
+              <a:graphicData uri="http://schemas.openxmlformats.org/drawingml/2006/picture">
+                <pic:pic xmlns:pic="http://schemas.openxmlformats.org/drawingml/2006/picture">
+                  <pic:nvPicPr>
+                    <pic:cNvPr id="848655269" name="Picture 1" descr="A graph of a function&#10;&#10;AI-generated content may be incorrect."/>
+                    <pic:cNvPicPr/>
+                  </pic:nvPicPr>
+                  <pic:blipFill>
+                    <a:blip r:embed="rId6">
+                      <a:extLst>
+                        <a:ext uri="{28A0092B-C50C-407E-A947-70E740481C1C}">
+                          <a14:useLocalDpi xmlns:a14="http://schemas.microsoft.com/office/drawing/2010/main" val="0"/>
+                        </a:ext>
+                      </a:extLst>
+                    </a:blip>
+                    <a:stretch>
+                      <a:fillRect/>
+                    </a:stretch>
+                  </pic:blipFill>
+                  <pic:spPr>
+                    <a:xfrm>
+                      <a:off x="0" y="0"/>
+                      <a:ext cx="3001645" cy="2998470"/>
+                    </a:xfrm>
+                    <a:prstGeom prst="rect">
+                      <a:avLst/>
+                    </a:prstGeom>
+                  </pic:spPr>
+                </pic:pic>
+              </a:graphicData>
+            </a:graphic>
+            <wp14:sizeRelH relativeFrom="margin">
+              <wp14:pctWidth>0</wp14:pctWidth>
+            </wp14:sizeRelH>
+            <wp14:sizeRelV relativeFrom="margin">
+              <wp14:pctHeight>0</wp14:pctHeight>
+            </wp14:sizeRelV>
+          </wp:anchor>
+        </w:drawing>
+      </w:r>
+      <w:r>
+        <w:rPr>
+          <w:lang w:val="en-US"/>
+        </w:rPr>
+        <w:t>F3:</w:t>
+      </w:r>
+      <w:r>
+        <w:rPr>
+          <w:lang w:val="en-US"/>
+        </w:rPr>
+        <w:br/>
+      </w:r>
+      <w:r>
+        <w:rPr>
+          <w:lang w:val="en-US"/>
+        </w:rPr>
+        <w:t>For function 3, both RLS and the (1+1) EA reaches optimum quickly once again</w:t>
+      </w:r>
+      <w:r>
+        <w:rPr>
+          <w:lang w:val="en-US"/>
+        </w:rPr>
+        <w:t>, w</w:t>
+      </w:r>
+      <w:r>
+        <w:rPr>
+          <w:lang w:val="en-US"/>
+        </w:rPr>
+        <w:t>ith RLS having best performance.</w:t>
+      </w:r>
+      <w:r>
+        <w:rPr>
+          <w:lang w:val="en-US"/>
+        </w:rPr>
+        <w:t xml:space="preserve"> </w:t>
+      </w:r>
+      <w:r>
+        <w:rPr>
+          <w:lang w:val="en-US"/>
+        </w:rPr>
+        <w:t>Random Search, once again, levels below optimum, and increases much more slowly.</w:t>
+      </w:r>
+      <w:r>
+        <w:rPr>
+          <w:lang w:val="en-US"/>
+        </w:rPr>
+        <w:t xml:space="preserve"> S</w:t>
+      </w:r>
+      <w:r>
+        <w:rPr>
+          <w:lang w:val="en-US"/>
+        </w:rPr>
+        <w:t>tandard deviation for random search remains pretty much similar for the entire budget.</w:t>
+      </w:r>
+    </w:p>
+    <w:p>
+      <w:pPr>
+        <w:jc w:val="both"/>
+        <w:rPr>
+          <w:lang w:val="en-US"/>
+        </w:rPr>
+      </w:pPr>
+    </w:p>
+    <w:p>
+      <w:pPr>
+        <w:jc w:val="both"/>
+        <w:rPr>
+          <w:lang w:val="en-US"/>
+        </w:rPr>
+      </w:pPr>
+    </w:p>
+    <w:p>
+      <w:pPr>
+        <w:jc w:val="both"/>
+        <w:rPr>
+          <w:lang w:val="en-US"/>
+        </w:rPr>
+      </w:pPr>
+    </w:p>
+    <w:p>
+      <w:pPr>
+        <w:jc w:val="both"/>
+        <w:rPr>
+          <w:lang w:val="en-US"/>
+        </w:rPr>
+      </w:pPr>
+    </w:p>
+    <w:p>
+      <w:pPr>
+        <w:jc w:val="both"/>
+        <w:rPr>
+          <w:lang w:val="en-US"/>
+        </w:rPr>
+      </w:pPr>
+      <w:r>
+        <w:rPr>
+          <w:noProof/>
+        </w:rPr>
+        <w:drawing>
+          <wp:anchor distT="0" distB="0" distL="114300" distR="114300" simplePos="0" relativeHeight="251661312" behindDoc="0" locked="0" layoutInCell="1" allowOverlap="1" wp14:anchorId="2BD84E6A" wp14:editId="4A0F58F2">
+            <wp:simplePos x="0" y="0"/>
+            <wp:positionH relativeFrom="margin">
+              <wp:align>left</wp:align>
+            </wp:positionH>
+            <wp:positionV relativeFrom="paragraph">
+              <wp:posOffset>233680</wp:posOffset>
+            </wp:positionV>
+            <wp:extent cx="2816225" cy="2825750"/>
+            <wp:effectExtent l="0" t="0" r="3175" b="0"/>
+            <wp:wrapThrough wrapText="bothSides">
+              <wp:wrapPolygon edited="0">
+                <wp:start x="0" y="0"/>
+                <wp:lineTo x="0" y="21406"/>
+                <wp:lineTo x="21478" y="21406"/>
+                <wp:lineTo x="21478" y="0"/>
+                <wp:lineTo x="0" y="0"/>
+              </wp:wrapPolygon>
+            </wp:wrapThrough>
+            <wp:docPr id="1452027546" name="Picture 1" descr="A graph of a function&#10;&#10;AI-generated content may be incorrect."/>
+            <wp:cNvGraphicFramePr>
+              <a:graphicFrameLocks xmlns:a="http://schemas.openxmlformats.org/drawingml/2006/main" noChangeAspect="1"/>
+            </wp:cNvGraphicFramePr>
+            <a:graphic xmlns:a="http://schemas.openxmlformats.org/drawingml/2006/main">
+              <a:graphicData uri="http://schemas.openxmlformats.org/drawingml/2006/picture">
+                <pic:pic xmlns:pic="http://schemas.openxmlformats.org/drawingml/2006/picture">
+                  <pic:nvPicPr>
+                    <pic:cNvPr id="1452027546" name="Picture 1" descr="A graph of a function&#10;&#10;AI-generated content may be incorrect."/>
+                    <pic:cNvPicPr/>
+                  </pic:nvPicPr>
+                  <pic:blipFill>
+                    <a:blip r:embed="rId7">
+                      <a:extLst>
+                        <a:ext uri="{28A0092B-C50C-407E-A947-70E740481C1C}">
+                          <a14:useLocalDpi xmlns:a14="http://schemas.microsoft.com/office/drawing/2010/main" val="0"/>
+                        </a:ext>
+                      </a:extLst>
+                    </a:blip>
+                    <a:stretch>
+                      <a:fillRect/>
+                    </a:stretch>
+                  </pic:blipFill>
+                  <pic:spPr>
+                    <a:xfrm>
+                      <a:off x="0" y="0"/>
+                      <a:ext cx="2816225" cy="2825750"/>
+                    </a:xfrm>
+                    <a:prstGeom prst="rect">
+                      <a:avLst/>
+                    </a:prstGeom>
+                  </pic:spPr>
+                </pic:pic>
+              </a:graphicData>
+            </a:graphic>
+            <wp14:sizeRelH relativeFrom="margin">
+              <wp14:pctWidth>0</wp14:pctWidth>
+            </wp14:sizeRelH>
+            <wp14:sizeRelV relativeFrom="margin">
+              <wp14:pctHeight>0</wp14:pctHeight>
+            </wp14:sizeRelV>
+          </wp:anchor>
+        </w:drawing>
+      </w:r>
+      <w:r>
+        <w:rPr>
+          <w:lang w:val="en-US"/>
+        </w:rPr>
+        <w:t>F18:</w:t>
+      </w:r>
+    </w:p>
+    <w:p>
+      <w:pPr>
+        <w:jc w:val="both"/>
+        <w:rPr>
+          <w:lang w:val="en-US"/>
+        </w:rPr>
+      </w:pPr>
+      <w:r>
+        <w:rPr>
+          <w:lang w:val="en-US"/>
+        </w:rPr>
+        <w:t xml:space="preserve">For function 18, algorithms RLS and (1+1) EA illustrates </w:t>
+      </w:r>
+      <w:proofErr w:type="gramStart"/>
+      <w:r>
+        <w:rPr>
+          <w:lang w:val="en-US"/>
+        </w:rPr>
+        <w:t>improves</w:t>
+      </w:r>
+      <w:proofErr w:type="gramEnd"/>
+      <w:r>
+        <w:rPr>
+          <w:lang w:val="en-US"/>
+        </w:rPr>
+        <w:t xml:space="preserve"> smoothly and outperforms Random Search.</w:t>
+      </w:r>
+      <w:r>
+        <w:rPr>
+          <w:lang w:val="en-US"/>
+        </w:rPr>
+        <w:t xml:space="preserve"> </w:t>
+      </w:r>
+      <w:r>
+        <w:rPr>
+          <w:lang w:val="en-US"/>
+        </w:rPr>
+        <w:t xml:space="preserve">It is noticed that convergence for function 18 is much slower compared to previous, </w:t>
+      </w:r>
+      <w:proofErr w:type="gramStart"/>
+      <w:r>
+        <w:rPr>
+          <w:lang w:val="en-US"/>
+        </w:rPr>
+        <w:t>more simpler</w:t>
+      </w:r>
+      <w:proofErr w:type="gramEnd"/>
+      <w:r>
+        <w:rPr>
+          <w:lang w:val="en-US"/>
+        </w:rPr>
+        <w:t xml:space="preserve"> functions. </w:t>
+      </w:r>
+    </w:p>
+    <w:p>
+      <w:pPr>
+        <w:jc w:val="both"/>
+        <w:rPr>
+          <w:lang w:val="en-US"/>
+        </w:rPr>
+      </w:pPr>
+    </w:p>
+    <w:p>
+      <w:pPr>
+        <w:jc w:val="both"/>
+        <w:rPr>
+          <w:lang w:val="en-US"/>
+        </w:rPr>
+      </w:pPr>
+    </w:p>
+    <w:p>
+      <w:pPr>
+        <w:jc w:val="both"/>
+        <w:rPr>
+          <w:lang w:val="en-US"/>
+        </w:rPr>
+      </w:pPr>
+    </w:p>
+    <w:p>
+      <w:pPr>
+        <w:jc w:val="both"/>
+        <w:rPr>
+          <w:lang w:val="en-US"/>
+        </w:rPr>
+      </w:pPr>
+      <w:r>
+        <w:rPr>
+          <w:noProof/>
+        </w:rPr>
+        <w:drawing>
+          <wp:anchor distT="0" distB="0" distL="114300" distR="114300" simplePos="0" relativeHeight="251662336" behindDoc="0" locked="0" layoutInCell="1" allowOverlap="1" wp14:anchorId="6CC1F7EA" wp14:editId="7A8A7882">
+            <wp:simplePos x="0" y="0"/>
+            <wp:positionH relativeFrom="margin">
+              <wp:posOffset>3057525</wp:posOffset>
+            </wp:positionH>
+            <wp:positionV relativeFrom="paragraph">
+              <wp:posOffset>257175</wp:posOffset>
+            </wp:positionV>
+            <wp:extent cx="2609850" cy="2609850"/>
+            <wp:effectExtent l="0" t="0" r="0" b="0"/>
+            <wp:wrapThrough wrapText="bothSides">
+              <wp:wrapPolygon edited="0">
+                <wp:start x="0" y="0"/>
+                <wp:lineTo x="0" y="21442"/>
+                <wp:lineTo x="21442" y="21442"/>
+                <wp:lineTo x="21442" y="0"/>
+                <wp:lineTo x="0" y="0"/>
+              </wp:wrapPolygon>
+            </wp:wrapThrough>
+            <wp:docPr id="1257575604" name="Picture 1" descr="A graph with a line graph&#10;&#10;AI-generated content may be incorrect."/>
+            <wp:cNvGraphicFramePr>
+              <a:graphicFrameLocks xmlns:a="http://schemas.openxmlformats.org/drawingml/2006/main" noChangeAspect="1"/>
+            </wp:cNvGraphicFramePr>
+            <a:graphic xmlns:a="http://schemas.openxmlformats.org/drawingml/2006/main">
+              <a:graphicData uri="http://schemas.openxmlformats.org/drawingml/2006/picture">
+                <pic:pic xmlns:pic="http://schemas.openxmlformats.org/drawingml/2006/picture">
+                  <pic:nvPicPr>
+                    <pic:cNvPr id="1257575604" name="Picture 1" descr="A graph with a line graph&#10;&#10;AI-generated content may be incorrect."/>
+                    <pic:cNvPicPr/>
+                  </pic:nvPicPr>
+                  <pic:blipFill>
+                    <a:blip r:embed="rId8">
+                      <a:extLst>
+                        <a:ext uri="{28A0092B-C50C-407E-A947-70E740481C1C}">
+                          <a14:useLocalDpi xmlns:a14="http://schemas.microsoft.com/office/drawing/2010/main" val="0"/>
+                        </a:ext>
+                      </a:extLst>
+                    </a:blip>
+                    <a:stretch>
+                      <a:fillRect/>
+                    </a:stretch>
+                  </pic:blipFill>
+                  <pic:spPr>
+                    <a:xfrm>
+                      <a:off x="0" y="0"/>
+                      <a:ext cx="2609850" cy="2609850"/>
+                    </a:xfrm>
+                    <a:prstGeom prst="rect">
+                      <a:avLst/>
+                    </a:prstGeom>
+                  </pic:spPr>
+                </pic:pic>
+              </a:graphicData>
+            </a:graphic>
+            <wp14:sizeRelH relativeFrom="margin">
+              <wp14:pctWidth>0</wp14:pctWidth>
+            </wp14:sizeRelH>
+            <wp14:sizeRelV relativeFrom="margin">
+              <wp14:pctHeight>0</wp14:pctHeight>
+            </wp14:sizeRelV>
+          </wp:anchor>
+        </w:drawing>
+      </w:r>
+    </w:p>
+    <w:p>
+      <w:pPr>
+        <w:jc w:val="both"/>
+        <w:rPr>
+          <w:lang w:val="en-US"/>
+        </w:rPr>
+      </w:pPr>
+      <w:r>
+        <w:rPr>
+          <w:lang w:val="en-US"/>
+        </w:rPr>
+        <w:t>F23:</w:t>
+      </w:r>
+    </w:p>
+    <w:p>
+      <w:pPr>
+        <w:jc w:val="both"/>
+        <w:rPr>
+          <w:lang w:val="en-US"/>
+        </w:rPr>
+      </w:pPr>
+      <w:r>
+        <w:rPr>
+          <w:lang w:val="en-US"/>
+        </w:rPr>
+        <w:t xml:space="preserve">For function 23, all three algorithms quickly </w:t>
+      </w:r>
+      <w:proofErr w:type="gramStart"/>
+      <w:r>
+        <w:rPr>
+          <w:lang w:val="en-US"/>
+        </w:rPr>
+        <w:t>converges</w:t>
+      </w:r>
+      <w:proofErr w:type="gramEnd"/>
+      <w:r>
+        <w:rPr>
+          <w:lang w:val="en-US"/>
+        </w:rPr>
+        <w:t>, nearly reaching optimum within the range of only a few thousand evaluations. Consistent with previous functions, both RLS and the (1+1) EA outperforms Random Search.</w:t>
+      </w:r>
+      <w:r>
+        <w:rPr>
+          <w:lang w:val="en-US"/>
+        </w:rPr>
+        <w:t xml:space="preserve"> </w:t>
+      </w:r>
+      <w:r>
+        <w:rPr>
+          <w:lang w:val="en-US"/>
+        </w:rPr>
+        <w:t xml:space="preserve">The </w:t>
+      </w:r>
+      <w:proofErr w:type="gramStart"/>
+      <w:r>
+        <w:rPr>
+          <w:lang w:val="en-US"/>
+        </w:rPr>
+        <w:t>small shaded</w:t>
+      </w:r>
+      <w:proofErr w:type="gramEnd"/>
+      <w:r>
+        <w:rPr>
+          <w:lang w:val="en-US"/>
+        </w:rPr>
+        <w:t xml:space="preserve"> areas</w:t>
+      </w:r>
+      <w:r>
+        <w:rPr>
+          <w:lang w:val="en-US"/>
+        </w:rPr>
+        <w:t xml:space="preserve"> </w:t>
+      </w:r>
+      <w:proofErr w:type="gramStart"/>
+      <w:r>
+        <w:rPr>
+          <w:lang w:val="en-US"/>
+        </w:rPr>
+        <w:t>demonstrates</w:t>
+      </w:r>
+      <w:proofErr w:type="gramEnd"/>
+      <w:r>
+        <w:rPr>
+          <w:lang w:val="en-US"/>
+        </w:rPr>
+        <w:t xml:space="preserve"> stability for all three algorithms.</w:t>
+      </w:r>
+    </w:p>
+    <w:p>
+      <w:pPr>
+        <w:jc w:val="both"/>
+        <w:rPr>
+          <w:lang w:val="en-US"/>
+        </w:rPr>
+      </w:pPr>
+      <w:r>
+        <w:rPr>
+          <w:noProof/>
+        </w:rPr>
+        <w:lastRenderedPageBreak/>
+        <w:drawing>
+          <wp:anchor distT="0" distB="0" distL="114300" distR="114300" simplePos="0" relativeHeight="251663360" behindDoc="0" locked="0" layoutInCell="1" allowOverlap="1" wp14:anchorId="59D5356F" wp14:editId="48C08549">
+            <wp:simplePos x="0" y="0"/>
+            <wp:positionH relativeFrom="margin">
+              <wp:align>right</wp:align>
+            </wp:positionH>
+            <wp:positionV relativeFrom="paragraph">
+              <wp:posOffset>0</wp:posOffset>
+            </wp:positionV>
+            <wp:extent cx="2895600" cy="2891155"/>
+            <wp:effectExtent l="0" t="0" r="0" b="4445"/>
+            <wp:wrapThrough wrapText="bothSides">
+              <wp:wrapPolygon edited="0">
+                <wp:start x="0" y="0"/>
+                <wp:lineTo x="0" y="21491"/>
+                <wp:lineTo x="21458" y="21491"/>
+                <wp:lineTo x="21458" y="0"/>
+                <wp:lineTo x="0" y="0"/>
+              </wp:wrapPolygon>
+            </wp:wrapThrough>
+            <wp:docPr id="1620620805" name="Picture 1" descr="A graph with different colored lines&#10;&#10;AI-generated content may be incorrect."/>
+            <wp:cNvGraphicFramePr>
+              <a:graphicFrameLocks xmlns:a="http://schemas.openxmlformats.org/drawingml/2006/main" noChangeAspect="1"/>
+            </wp:cNvGraphicFramePr>
+            <a:graphic xmlns:a="http://schemas.openxmlformats.org/drawingml/2006/main">
+              <a:graphicData uri="http://schemas.openxmlformats.org/drawingml/2006/picture">
+                <pic:pic xmlns:pic="http://schemas.openxmlformats.org/drawingml/2006/picture">
+                  <pic:nvPicPr>
+                    <pic:cNvPr id="1620620805" name="Picture 1" descr="A graph with different colored lines&#10;&#10;AI-generated content may be incorrect."/>
+                    <pic:cNvPicPr/>
+                  </pic:nvPicPr>
+                  <pic:blipFill>
+                    <a:blip r:embed="rId9">
+                      <a:extLst>
+                        <a:ext uri="{28A0092B-C50C-407E-A947-70E740481C1C}">
+                          <a14:useLocalDpi xmlns:a14="http://schemas.microsoft.com/office/drawing/2010/main" val="0"/>
+                        </a:ext>
+                      </a:extLst>
+                    </a:blip>
+                    <a:stretch>
+                      <a:fillRect/>
+                    </a:stretch>
+                  </pic:blipFill>
+                  <pic:spPr>
+                    <a:xfrm>
+                      <a:off x="0" y="0"/>
+                      <a:ext cx="2895600" cy="2891155"/>
+                    </a:xfrm>
+                    <a:prstGeom prst="rect">
+                      <a:avLst/>
+                    </a:prstGeom>
+                  </pic:spPr>
+                </pic:pic>
+              </a:graphicData>
+            </a:graphic>
+            <wp14:sizeRelH relativeFrom="margin">
+              <wp14:pctWidth>0</wp14:pctWidth>
+            </wp14:sizeRelH>
+            <wp14:sizeRelV relativeFrom="margin">
+              <wp14:pctHeight>0</wp14:pctHeight>
+            </wp14:sizeRelV>
+          </wp:anchor>
+        </w:drawing>
+      </w:r>
+      <w:r>
+        <w:rPr>
+          <w:lang w:val="en-US"/>
+        </w:rPr>
+        <w:t>F24:</w:t>
+      </w:r>
+    </w:p>
+    <w:p>
+      <w:pPr>
+        <w:jc w:val="both"/>
+        <w:rPr>
+          <w:lang w:val="en-US"/>
+        </w:rPr>
+      </w:pPr>
+      <w:r>
+        <w:rPr>
+          <w:lang w:val="en-US"/>
+        </w:rPr>
+        <w:t>For function 24, Random Search once again plateaus far below the optimum.</w:t>
+      </w:r>
+      <w:r>
+        <w:rPr>
+          <w:lang w:val="en-US"/>
+        </w:rPr>
+        <w:t xml:space="preserve"> </w:t>
+      </w:r>
+      <w:r>
+        <w:rPr>
+          <w:lang w:val="en-US"/>
+        </w:rPr>
+        <w:t xml:space="preserve">Instead, both RLS and the (1+1) EA </w:t>
+      </w:r>
+      <w:proofErr w:type="gramStart"/>
+      <w:r>
+        <w:rPr>
+          <w:lang w:val="en-US"/>
+        </w:rPr>
+        <w:t>converges</w:t>
+      </w:r>
+      <w:proofErr w:type="gramEnd"/>
+      <w:r>
+        <w:rPr>
+          <w:lang w:val="en-US"/>
+        </w:rPr>
+        <w:t xml:space="preserve"> to the maximum, with RLS having slightly better performance. The shaded areas </w:t>
+      </w:r>
+      <w:proofErr w:type="gramStart"/>
+      <w:r>
+        <w:rPr>
+          <w:lang w:val="en-US"/>
+        </w:rPr>
+        <w:t>shows</w:t>
+      </w:r>
+      <w:proofErr w:type="gramEnd"/>
+      <w:r>
+        <w:rPr>
+          <w:lang w:val="en-US"/>
+        </w:rPr>
+        <w:t xml:space="preserve"> standard deviation that is of moderate level, but overall, random sampling remains on bottom.</w:t>
+      </w:r>
+    </w:p>
+    <w:p>
+      <w:pPr>
+        <w:jc w:val="both"/>
+        <w:rPr>
+          <w:lang w:val="en-US"/>
+        </w:rPr>
+      </w:pPr>
+    </w:p>
+    <w:p>
+      <w:pPr>
+        <w:jc w:val="both"/>
+        <w:rPr>
+          <w:lang w:val="en-US"/>
+        </w:rPr>
+      </w:pPr>
+    </w:p>
+    <w:p>
+      <w:pPr>
+        <w:jc w:val="both"/>
+        <w:rPr>
+          <w:lang w:val="en-US"/>
+        </w:rPr>
+      </w:pPr>
+      <w:r>
+        <w:rPr>
+          <w:noProof/>
+        </w:rPr>
+        <w:drawing>
+          <wp:anchor distT="0" distB="0" distL="114300" distR="114300" simplePos="0" relativeHeight="251664384" behindDoc="0" locked="0" layoutInCell="1" allowOverlap="1" wp14:anchorId="199EC743" wp14:editId="3D98EBCA">
+            <wp:simplePos x="0" y="0"/>
+            <wp:positionH relativeFrom="margin">
+              <wp:align>left</wp:align>
+            </wp:positionH>
+            <wp:positionV relativeFrom="paragraph">
+              <wp:posOffset>203835</wp:posOffset>
+            </wp:positionV>
+            <wp:extent cx="2892425" cy="2888615"/>
+            <wp:effectExtent l="0" t="0" r="3175" b="6985"/>
+            <wp:wrapThrough wrapText="bothSides">
+              <wp:wrapPolygon edited="0">
+                <wp:start x="0" y="0"/>
+                <wp:lineTo x="0" y="21510"/>
+                <wp:lineTo x="21481" y="21510"/>
+                <wp:lineTo x="21481" y="0"/>
+                <wp:lineTo x="0" y="0"/>
+              </wp:wrapPolygon>
+            </wp:wrapThrough>
+            <wp:docPr id="1990616685" name="Picture 1" descr="A graph of a function&#10;&#10;AI-generated content may be incorrect."/>
+            <wp:cNvGraphicFramePr>
+              <a:graphicFrameLocks xmlns:a="http://schemas.openxmlformats.org/drawingml/2006/main" noChangeAspect="1"/>
+            </wp:cNvGraphicFramePr>
+            <a:graphic xmlns:a="http://schemas.openxmlformats.org/drawingml/2006/main">
+              <a:graphicData uri="http://schemas.openxmlformats.org/drawingml/2006/picture">
+                <pic:pic xmlns:pic="http://schemas.openxmlformats.org/drawingml/2006/picture">
+                  <pic:nvPicPr>
+                    <pic:cNvPr id="1990616685" name="Picture 1" descr="A graph of a function&#10;&#10;AI-generated content may be incorrect."/>
+                    <pic:cNvPicPr/>
+                  </pic:nvPicPr>
+                  <pic:blipFill>
+                    <a:blip r:embed="rId10">
+                      <a:extLst>
+                        <a:ext uri="{28A0092B-C50C-407E-A947-70E740481C1C}">
+                          <a14:useLocalDpi xmlns:a14="http://schemas.microsoft.com/office/drawing/2010/main" val="0"/>
+                        </a:ext>
+                      </a:extLst>
+                    </a:blip>
+                    <a:stretch>
+                      <a:fillRect/>
+                    </a:stretch>
+                  </pic:blipFill>
+                  <pic:spPr>
+                    <a:xfrm>
+                      <a:off x="0" y="0"/>
+                      <a:ext cx="2892425" cy="2888615"/>
+                    </a:xfrm>
+                    <a:prstGeom prst="rect">
+                      <a:avLst/>
+                    </a:prstGeom>
+                  </pic:spPr>
+                </pic:pic>
+              </a:graphicData>
+            </a:graphic>
+            <wp14:sizeRelH relativeFrom="margin">
+              <wp14:pctWidth>0</wp14:pctWidth>
+            </wp14:sizeRelH>
+            <wp14:sizeRelV relativeFrom="margin">
+              <wp14:pctHeight>0</wp14:pctHeight>
+            </wp14:sizeRelV>
+          </wp:anchor>
+        </w:drawing>
+      </w:r>
+      <w:r>
+        <w:rPr>
+          <w:lang w:val="en-US"/>
+        </w:rPr>
+        <w:t>F25:</w:t>
+      </w:r>
+      <w:r>
+        <w:rPr>
+          <w:noProof/>
+        </w:rPr>
+        <w:t xml:space="preserve"> </w:t>
+      </w:r>
+    </w:p>
+    <w:p>
+      <w:pPr>
+        <w:jc w:val="both"/>
+        <w:rPr>
+          <w:lang w:val="en-US"/>
+        </w:rPr>
+      </w:pPr>
+      <w:r>
+        <w:rPr>
+          <w:lang w:val="en-US"/>
+        </w:rPr>
+        <w:t>For function 25, random Search again falls far behind, though improving slowly.</w:t>
+      </w:r>
+      <w:r>
+        <w:rPr>
+          <w:lang w:val="en-US"/>
+        </w:rPr>
+        <w:t xml:space="preserve"> </w:t>
+      </w:r>
+      <w:r>
+        <w:rPr>
+          <w:lang w:val="en-US"/>
+        </w:rPr>
+        <w:t xml:space="preserve">RLS and the (1+1) EA improves quickly at first, but </w:t>
+      </w:r>
+      <w:proofErr w:type="spellStart"/>
+      <w:r>
+        <w:rPr>
+          <w:lang w:val="en-US"/>
+        </w:rPr>
+        <w:t>rls</w:t>
+      </w:r>
+      <w:proofErr w:type="spellEnd"/>
+      <w:r>
+        <w:rPr>
+          <w:lang w:val="en-US"/>
+        </w:rPr>
+        <w:t xml:space="preserve"> plateau earlier, while the (1+1)</w:t>
+      </w:r>
+      <w:r>
+        <w:rPr>
+          <w:lang w:val="en-US"/>
+        </w:rPr>
+        <w:t xml:space="preserve"> </w:t>
+      </w:r>
+      <w:r>
+        <w:rPr>
+          <w:lang w:val="en-US"/>
+        </w:rPr>
+        <w:t>EA continues to progress, and exceeds RLS' max score. Overall, (1+1) EA came out on top with best top score.</w:t>
+      </w:r>
+    </w:p>
+    <w:p>
+      <w:pPr>
+        <w:jc w:val="both"/>
+        <w:rPr>
+          <w:lang w:val="en-US"/>
+        </w:rPr>
+      </w:pPr>
+    </w:p>
+    <w:p>
+      <w:pPr>
+        <w:jc w:val="both"/>
+        <w:rPr>
+          <w:lang w:val="en-US"/>
+        </w:rPr>
+      </w:pPr>
+    </w:p>
+    <w:p>
+      <w:pPr>
+        <w:jc w:val="both"/>
+        <w:rPr>
+          <w:lang w:val="en-US"/>
+        </w:rPr>
+      </w:pPr>
+    </w:p>
+    <w:p>
+      <w:pPr>
+        <w:jc w:val="both"/>
+        <w:rPr>
+          <w:lang w:val="en-US"/>
+        </w:rPr>
+      </w:pPr>
+    </w:p>
+    <w:p>
+      <w:pPr>
+        <w:jc w:val="both"/>
+        <w:rPr>
+          <w:sz w:val="28"/>
+          <w:szCs w:val="28"/>
+          <w:lang w:val="en-US"/>
+        </w:rPr>
+      </w:pPr>
+      <w:r>
+        <w:rPr>
+          <w:sz w:val="28"/>
+          <w:szCs w:val="28"/>
+          <w:lang w:val="en-US"/>
+        </w:rPr>
+        <w:t>Summary:</w:t>
+      </w:r>
+    </w:p>
+    <w:p>
+      <w:pPr>
+        <w:jc w:val="both"/>
+        <w:rPr>
+          <w:lang w:val="en-US"/>
+        </w:rPr>
+      </w:pPr>
+      <w:r>
+        <w:rPr>
+          <w:lang w:val="en-US"/>
+        </w:rPr>
+        <w:t xml:space="preserve">Across all functions, </w:t>
+      </w:r>
+      <w:r>
+        <w:rPr>
+          <w:lang w:val="en-US"/>
+        </w:rPr>
+        <w:t>RLS and (1+</w:t>
+      </w:r>
+      <w:proofErr w:type="gramStart"/>
+      <w:r>
+        <w:rPr>
+          <w:lang w:val="en-US"/>
+        </w:rPr>
+        <w:t>1)EA</w:t>
+      </w:r>
+      <w:proofErr w:type="gramEnd"/>
+      <w:r>
+        <w:rPr>
+          <w:lang w:val="en-US"/>
+        </w:rPr>
+        <w:t xml:space="preserve"> consistently outperforms random search </w:t>
+      </w:r>
+      <w:r>
+        <w:rPr>
+          <w:lang w:val="en-US"/>
+        </w:rPr>
+        <w:t xml:space="preserve">which would </w:t>
+      </w:r>
+      <w:r>
+        <w:rPr>
+          <w:lang w:val="en-US"/>
+        </w:rPr>
+        <w:t xml:space="preserve">plateau below the optimum and </w:t>
+      </w:r>
+      <w:r>
+        <w:rPr>
+          <w:lang w:val="en-US"/>
+        </w:rPr>
+        <w:t>demonstrate</w:t>
+      </w:r>
+      <w:r>
+        <w:rPr>
+          <w:lang w:val="en-US"/>
+        </w:rPr>
+        <w:t xml:space="preserve"> higher variance across different runs.</w:t>
+      </w:r>
+      <w:r>
+        <w:rPr>
+          <w:lang w:val="en-US"/>
+        </w:rPr>
+        <w:t xml:space="preserve"> </w:t>
+      </w:r>
+      <w:r>
+        <w:rPr>
+          <w:lang w:val="en-US"/>
+        </w:rPr>
+        <w:t xml:space="preserve">On the other hand, RLS was much faster in gaining early progress and reliably </w:t>
+      </w:r>
+      <w:proofErr w:type="gramStart"/>
+      <w:r>
+        <w:rPr>
+          <w:lang w:val="en-US"/>
+        </w:rPr>
+        <w:t>reaches</w:t>
+      </w:r>
+      <w:proofErr w:type="gramEnd"/>
+      <w:r>
+        <w:rPr>
+          <w:lang w:val="en-US"/>
+        </w:rPr>
+        <w:t xml:space="preserve"> the optimum with lower variance, often emerging as the strongest performing out of the three</w:t>
+      </w:r>
+      <w:r>
+        <w:rPr>
+          <w:lang w:val="en-US"/>
+        </w:rPr>
+        <w:t xml:space="preserve"> on simpler functions. The (1+1) EA also reaches the optimum consistently, and in some cases surpasses RLS</w:t>
+      </w:r>
+      <w:r>
+        <w:rPr>
+          <w:lang w:val="en-US"/>
+        </w:rPr>
+        <w:t xml:space="preserve"> for harder functions. In general, guided methods such as RLS and (1+</w:t>
+      </w:r>
+      <w:proofErr w:type="gramStart"/>
+      <w:r>
+        <w:rPr>
+          <w:lang w:val="en-US"/>
+        </w:rPr>
+        <w:t>1)EA</w:t>
+      </w:r>
+      <w:proofErr w:type="gramEnd"/>
+      <w:r>
+        <w:rPr>
+          <w:lang w:val="en-US"/>
+        </w:rPr>
+        <w:t xml:space="preserve"> proved much better than random search.</w:t>
+      </w:r>
+    </w:p>
     <w:sectPr>
       <w:pgSz w:w="11906" w:h="16838"/>
       <w:pgMar w:top="1440" w:right="1440" w:bottom="1440" w:left="1440" w:header="708" w:footer="708" w:gutter="0"/>
@@ -616,7 +1969,6 @@
   <w:style w:type="character" w:default="1" w:styleId="DefaultParagraphFont">
     <w:name w:val="Default Paragraph Font"/>
     <w:uiPriority w:val="1"/>
-    <w:semiHidden/>
     <w:unhideWhenUsed/>
   </w:style>
   <w:style w:type="table" w:default="1" w:styleId="TableNormal">

</xml_diff>